<commit_message>
[WI-TEST] Vòng chạy đầy đủ 76 ca sau sáu đợt sửa — 11 Đạt, 57 Không đạt, 8 Bị chặn (16%)
Chấm lại toàn bộ trên vòng chạy đầy đủ, không giữ phán quyết của các lần chạy
lẻ. Hai ca KHÔNG ỔN ĐỊNH giữa các lần chạy được ghi riêng thay vì chấm theo
lần đẹp nhất:

  TC004 — unknown → 4 câu hỏi đúng bài toán; project.create → dự án lồng + hỏi ISA
  TC043 — lần nạp được tệp và trả lời đúng; lần E5002 vì slots.path không được
          điền. Cùng lần chạy, TC042 (câu cùng hình dạng) lại nạp được.

TC005 → Đạt: chỉ ra mâu thuẫn BẰNG SỐ (CR2032 220mAh không cấp nổi cho 4K),
nhờ DEV-206 cho req.elicit hỏi cả gaps.

Không ca nào treo; chậm nhất 95,5 s (vòng đầu có ca 904 s).

Co-Authored-By: Claude Opus 5 (1M context) <noreply@anthropic.com>
</commit_message>
<xml_diff>
--- a/docs/test/usecase/BAO-CAO-TONG-HOP.docx
+++ b/docs/test/usecase/BAO-CAO-TONG-HOP.docx
@@ -125,17 +125,17 @@
           </w:tcPr>
           <w:p>
             <w:r>
-              <w:t>10</w:t>
-            </w:r>
-          </w:p>
-        </w:tc>
-        <w:tc>
-          <w:tcPr>
-            <w:tcW w:type="dxa" w:w="1728"/>
-          </w:tcPr>
-          <w:p>
-            <w:r>
-              <w:t>29</w:t>
+              <w:t>9</w:t>
+            </w:r>
+          </w:p>
+        </w:tc>
+        <w:tc>
+          <w:tcPr>
+            <w:tcW w:type="dxa" w:w="1728"/>
+          </w:tcPr>
+          <w:p>
+            <w:r>
+              <w:t>30</w:t>
             </w:r>
           </w:p>
         </w:tc>
@@ -287,7 +287,7 @@
               <w:rPr>
                 <w:b/>
               </w:rPr>
-              <w:t>12</w:t>
+              <w:t>11</w:t>
             </w:r>
           </w:p>
         </w:tc>
@@ -300,7 +300,7 @@
               <w:rPr>
                 <w:b/>
               </w:rPr>
-              <w:t>56</w:t>
+              <w:t>57</w:t>
             </w:r>
           </w:p>
         </w:tc>
@@ -340,7 +340,7 @@
         <w:t xml:space="preserve">Tỉ lệ đạt trên số ca test được thật: </w:t>
       </w:r>
       <w:r>
-        <w:t>12/68 = 18%</w:t>
+        <w:t>11/68 = 16%</w:t>
       </w:r>
     </w:p>
     <w:p>
@@ -405,12 +405,12 @@
         <w:pStyle w:val="Heading2"/>
       </w:pPr>
       <w:r>
-        <w:t>N6 — không phản biện, không kết luận — 4 test case</w:t>
+        <w:t>N5 — chỉ thị cho công cụ bị biến thành YÊU CẦU của sản phẩm — 4 test case</w:t>
       </w:r>
     </w:p>
     <w:p>
       <w:r>
-        <w:t>Ca liên quan: TC003, TC005, TC006, TC021</w:t>
+        <w:t>Ca liên quan: TC017, TC024, TC028, TC073</w:t>
       </w:r>
     </w:p>
     <w:p>
@@ -418,12 +418,12 @@
         <w:pStyle w:val="Heading2"/>
       </w:pPr>
       <w:r>
-        <w:t>N5 — chỉ thị cho công cụ bị biến thành YÊU CẦU của sản phẩm — 4 test case</w:t>
+        <w:t>N6 — không phản biện, không kết luận — 3 test case</w:t>
       </w:r>
     </w:p>
     <w:p>
       <w:r>
-        <w:t>Ca liên quan: TC017, TC024, TC028, TC073</w:t>
+        <w:t>Ca liên quan: TC003, TC006, TC021</w:t>
       </w:r>
     </w:p>
     <w:p>
@@ -450,6 +450,19 @@
     <w:p>
       <w:r>
         <w:t>Ca liên quan: TC056, TC057, TC075</w:t>
+      </w:r>
+    </w:p>
+    <w:p>
+      <w:pPr>
+        <w:pStyle w:val="Heading2"/>
+      </w:pPr>
+      <w:r>
+        <w:t>KHÔNG ỔN ĐỊNH giữa các lần chạy — 2 test case</w:t>
+      </w:r>
+    </w:p>
+    <w:p>
+      <w:r>
+        <w:t>Ca liên quan: TC004, TC043</w:t>
       </w:r>
     </w:p>
     <w:p>
@@ -817,23 +830,23 @@
           <w:p>
             <w:r>
               <w:rPr>
-                <w:color w:val="1B7F3B"/>
-                <w:sz w:val="16"/>
-              </w:rPr>
-              <w:t>Đạt</w:t>
-            </w:r>
-          </w:p>
-        </w:tc>
-        <w:tc>
-          <w:tcPr>
-            <w:tcW w:type="dxa" w:w="1728"/>
-          </w:tcPr>
-          <w:p>
-            <w:r>
-              <w:rPr>
-                <w:sz w:val="16"/>
-              </w:rPr>
-              <w:t>Không bịa yêu cầu, không sinh thiết kế nào. Có đặt câu hỏi làm rõ VỀ BÀI TOÁN: “Chưa rõ yêu cầu về kết nối mạng (Wi-Fi, Bluetooth, Zigbee, LoRa)”.</w:t>
+                <w:color w:val="C02828"/>
+                <w:sz w:val="16"/>
+              </w:rPr>
+              <w:t>Không đạt</w:t>
+            </w:r>
+          </w:p>
+        </w:tc>
+        <w:tc>
+          <w:tcPr>
+            <w:tcW w:type="dxa" w:w="1728"/>
+          </w:tcPr>
+          <w:p>
+            <w:r>
+              <w:rPr>
+                <w:sz w:val="16"/>
+              </w:rPr>
+              <w:t>KHÔNG ỔN ĐỊNH. Khi `parse_intent` cho ra `unknown` thì tác tử hỏi BỐN câu về chính bài toán (“Mạch thông minh này cụ thể dùng để làm gì?”, “Nguồn cấp là gì?”, “Môi trường hoạt động?”) — đúng đề bài. Khi nó cho ra `project.create` (lần chạy đầy đủ 23/09) thì tạo một dự án LỒNG `mach-thong-minh/cai-mach-thong-minh` rồi hỏi ISA.</w:t>
             </w:r>
           </w:p>
         </w:tc>
@@ -885,23 +898,23 @@
           <w:p>
             <w:r>
               <w:rPr>
-                <w:color w:val="C02828"/>
-                <w:sz w:val="16"/>
-              </w:rPr>
-              <w:t>Không đạt</w:t>
-            </w:r>
-          </w:p>
-        </w:tc>
-        <w:tc>
-          <w:tcPr>
-            <w:tcW w:type="dxa" w:w="1728"/>
-          </w:tcPr>
-          <w:p>
-            <w:r>
-              <w:rPr>
-                <w:sz w:val="16"/>
-              </w:rPr>
-              <w:t>Rút ra hai yêu cầu có số liệu tốt (4K 24 fps độ trễ &lt; 200 ms qua LoRa; 43 800 giờ trên pin CR2032 220 mAh ⇒ ≤ 5 µA) và tự đánh dấu một yêu cầu “✖ KHÔNG ĐO ĐƯỢC”. Nhưng KHÔNG hề nói hai yêu cầu ấy mâu thuẫn nhau và bất khả thi vật lý; báo “✅ Xong 6/6 bước”.</w:t>
+                <w:color w:val="1B7F3B"/>
+                <w:sz w:val="16"/>
+              </w:rPr>
+              <w:t>Đạt</w:t>
+            </w:r>
+          </w:p>
+        </w:tc>
+        <w:tc>
+          <w:tcPr>
+            <w:tcW w:type="dxa" w:w="1728"/>
+          </w:tcPr>
+          <w:p>
+            <w:r>
+              <w:rPr>
+                <w:sz w:val="16"/>
+              </w:rPr>
+              <w:t>SAU [DEV-206]: chỉ ra mâu thuẫn BẰNG SỐ — “Pin nút áo (ví dụ CR2032) chỉ có dung lượng khoảng 220mAh, không thể cấp nguồn cho cảm biến 4K và vi điều khiển xử lý video liên tục”. Kèm 5 điểm cần làm rõ (môi trường, khả thi/nguồn…). Không đưa ra thiết kế giả vờ khả thi.</w:t>
             </w:r>
           </w:p>
         </w:tc>
@@ -3469,23 +3482,23 @@
           <w:p>
             <w:r>
               <w:rPr>
-                <w:color w:val="1B7F3B"/>
-                <w:sz w:val="16"/>
-              </w:rPr>
-              <w:t>Đạt</w:t>
-            </w:r>
-          </w:p>
-        </w:tc>
-        <w:tc>
-          <w:tcPr>
-            <w:tcW w:type="dxa" w:w="1728"/>
-          </w:tcPr>
-          <w:p>
-            <w:r>
-              <w:rPr>
-                <w:sz w:val="16"/>
-              </w:rPr>
-              <w:t>SAU [DEV-202]: “Thông tin về dải nhiệt độ hoạt động của MCU-X không có trong đoạn văn được cung cấp [1].” Đọc tài liệu thật, tìm không thấy, nói ra, kèm trích dẫn.</w:t>
+                <w:color w:val="C02828"/>
+                <w:sz w:val="16"/>
+              </w:rPr>
+              <w:t>Không đạt</w:t>
+            </w:r>
+          </w:p>
+        </w:tc>
+        <w:tc>
+          <w:tcPr>
+            <w:tcW w:type="dxa" w:w="1728"/>
+          </w:tcPr>
+          <w:p>
+            <w:r>
+              <w:rPr>
+                <w:sz w:val="16"/>
+              </w:rPr>
+              <w:t>KHÔNG ỔN ĐỊNH. Lần chạy riêng: đọc tài liệu và trả lời đúng “không có trong đoạn văn được cung cấp [1]”. Lần chạy đầy đủ 23/09: `view.rag_ask` hỏng E5002 “dự án chưa có tài liệu nào” — tệp trong câu KHÔNG được nạp.</w:t>
             </w:r>
           </w:p>
         </w:tc>
@@ -4981,7 +4994,7 @@
               <w:rPr>
                 <w:sz w:val="16"/>
               </w:rPr>
-              <w:t>Mở lại dự án rồi hỏi “Tiếp tục dự án này, trước đó đã chốt những gì?” — tác tử hỏi ngược “id hoặc đường dẫn” của dự án, dù dự án ĐANG MỞ. Không khôi phục được quyết định nào.</w:t>
+              <w:t>SAU [DEV-207]: hồi quy đã sửa — `project.open` chạy XONG, trả `summary` 14 trường kèm `previous_session` và `tiep_tuc`. Nhưng `previous_session.summary` là `null`, nên nó KHÔNG thuật lại được quyết định nào đã chốt — đúng thứ đề bài hỏi.</w:t>
             </w:r>
           </w:p>
         </w:tc>

</xml_diff>